<commit_message>
cleanup: remove DSA_NOTES.md (replaced by explanation_code.docx)
</commit_message>
<xml_diff>
--- a/explanation_code.docx
+++ b/explanation_code.docx
@@ -57,7 +57,7 @@
         <w:t xml:space="preserve">Real-world analogy: </w:t>
       </w:r>
       <w:r>
-        <w:t>A coat check counter. You hand over ticket "AAPL", the attendant goes straight to the rack labeled "AAPL" and hands you your coat. They never check every rack.</w:t>
+        <w:t>A coat check counter. You hand over ticket "AAPL", the attendant goes straight to the rack labeled "AAPL" and hands you your coat.</w:t>
       </w:r>
     </w:p>
     <w:p>
@@ -291,9 +291,6 @@
         <w:t>get / put / update / contains: O(1) average - constant time regardless of dataset size.</w:t>
         <w:br/>
         <w:t>all_records(): O(n) - must visit every bucket.</w:t>
-        <w:br/>
-        <w:br/>
-        <w:t>Why O(1)? The hash function converts the key to a bucket index directly - no scanning.</w:t>
       </w:r>
     </w:p>
     <w:p/>
@@ -547,7 +544,7 @@
         <w:t xml:space="preserve">Real-world analogy: </w:t>
       </w:r>
       <w:r>
-        <w:t>Your browser back button. You visit Page A - Page B - Page C. Clicking "Back" takes you to C first (most recent), then B, then A.</w:t>
+        <w:t>Your browser back button. You visit Page A - Page B - Page C. Clicking "Back" takes you to C first.</w:t>
       </w:r>
     </w:p>
     <w:p>
@@ -567,7 +564,7 @@
         <w:br/>
         <w:t>pop() -&gt; list.pop() -&gt; O(1) - take top plate off, save in undo buffer.</w:t>
         <w:br/>
-        <w:t>undo() -&gt; restores last popped alert from undo buffer - O(1).</w:t>
+        <w:t>undo() -&gt; restores last popped alert - O(1).</w:t>
       </w:r>
     </w:p>
     <w:p>
@@ -656,7 +653,7 @@
         <w:t xml:space="preserve">Real-world analogy: </w:t>
       </w:r>
       <w:r>
-        <w:t>A talent show judge keeping a clipboard of the top 10 contestants. When a new contestant performs, the judge checks: "Are you better than #10?" If yes, #10 is kicked off and the new contestant is inserted in the right spot.</w:t>
+        <w:t>A talent show judge keeping a clipboard of the top 10 contestants. When a new contestant performs: "Are you better than #10?" If yes, #10 is kicked off and the new contestant is inserted.</w:t>
       </w:r>
     </w:p>
     <w:p>
@@ -761,7 +758,31 @@
         <w:t xml:space="preserve">Real-world analogy: </w:t>
       </w:r>
       <w:r>
-        <w:t>Finding the shortest route on a subway map. You check all stations 1 stop away, then 2 stops away. The first time you reach your destination is the shortest path.</w:t>
+        <w:t>Finding the shortest route on a subway map. You check all stations 1 stop away, then 2 stops away.</w:t>
+      </w:r>
+    </w:p>
+    <w:p>
+      <w:pPr>
+        <w:pStyle w:val="Heading2"/>
+      </w:pPr>
+      <w:r>
+        <w:t>How BFS traverses the sector graph</w:t>
+      </w:r>
+    </w:p>
+    <w:p>
+      <w:r>
+        <w:t>BFS uses a Queue (FIFO). Steps:</w:t>
+        <w:br/>
+        <w:t>1. Start at TECH, add to queue</w:t>
+        <w:br/>
+        <w:t>2. Dequeue TECH, find its neighbors (MEDIA)</w:t>
+        <w:br/>
+        <w:t>3. Dequeue MEDIA, find its neighbors (FINANCE, CONSUMER)</w:t>
+        <w:br/>
+        <w:t>4. Continue until all sectors visited</w:t>
+        <w:br/>
+        <w:br/>
+        <w:t>BFS guarantees the SHORTEST path between any two nodes.</w:t>
       </w:r>
     </w:p>
     <w:p>
@@ -791,7 +812,23 @@
     </w:p>
     <w:p>
       <w:r>
-        <w:t>BFS Order: TECH - MEDIA - FINANCE - CONSUMER - RETAIL - ENERGY - HEALTHCARE - TRANSPORT</w:t>
+        <w:t>BFS Order: TECH -&gt; MEDIA -&gt; FINANCE -&gt; CONSUMER -&gt; RETAIL -&gt; ENERGY -&gt; HEALTHCARE -&gt; TRANSPORT</w:t>
+      </w:r>
+    </w:p>
+    <w:p>
+      <w:pPr>
+        <w:pStyle w:val="Heading2"/>
+      </w:pPr>
+      <w:r>
+        <w:t>Understanding the BFS order</w:t>
+      </w:r>
+    </w:p>
+    <w:p>
+      <w:r>
+        <w:t>TECH (start) -&gt; MEDIA (1 step away) -&gt; FINANCE, CONSUMER (2 steps) -&gt; RETAIL, ENERGY (3 steps) -&gt; HEALTHCARE, TRANSPORT (4 steps).</w:t>
+        <w:br/>
+        <w:br/>
+        <w:t>BFS goes level-by-level: it visits all sectors at distance 1 first, then all at distance 2, etc. This is why MEDIA comes right after TECH - it is the only direct neighbor. FINANCE and CONSUMER come next because they are 2 steps from TECH (via MEDIA).</w:t>
       </w:r>
     </w:p>
     <w:p/>
@@ -813,7 +850,7 @@
     </w:p>
     <w:p>
       <w:r>
-        <w:t>DFS explores a graph by going deep first - like exploring a maze by following one wall until you hit a dead end, then backtracking.</w:t>
+        <w:t>DFS goes DEEP first - like exploring a maze by following one wall until you hit a dead end, then backtracking.</w:t>
       </w:r>
     </w:p>
     <w:p>
@@ -825,6 +862,30 @@
       </w:r>
       <w:r>
         <w:t>Solving a maze. Pick a direction and walk until you hit a wall, then backtrack and try another path.</w:t>
+      </w:r>
+    </w:p>
+    <w:p>
+      <w:pPr>
+        <w:pStyle w:val="Heading2"/>
+      </w:pPr>
+      <w:r>
+        <w:t>How DFS traverses the sector graph</w:t>
+      </w:r>
+    </w:p>
+    <w:p>
+      <w:r>
+        <w:t>DFS uses a Stack (LIFO). Steps:</w:t>
+        <w:br/>
+        <w:t>1. Start at TECH, push onto stack</w:t>
+        <w:br/>
+        <w:t>2. Pop TECH, push its first unvisited neighbor (MEDIA)</w:t>
+        <w:br/>
+        <w:t>3. Pop MEDIA, push its first unvisited neighbor (CONSUMER)</w:t>
+        <w:br/>
+        <w:t>4. Keep going DEEP until no more neighbors, then BACKTRACK</w:t>
+        <w:br/>
+        <w:br/>
+        <w:t>DFS does NOT guarantee the shortest path - it explores depth first.</w:t>
       </w:r>
     </w:p>
     <w:p>
@@ -854,7 +915,7 @@
     </w:p>
     <w:p>
       <w:r>
-        <w:t>DFS Order: TECH - MEDIA - CONSUMER - ENERGY - TRANSPORT - RETAIL - FINANCE - HEALTHCARE</w:t>
+        <w:t>DFS Order: TECH -&gt; MEDIA -&gt; CONSUMER -&gt; ENERGY -&gt; TRANSPORT -&gt; RETAIL -&gt; FINANCE -&gt; HEALTHCARE</w:t>
       </w:r>
     </w:p>
     <w:p>
@@ -862,147 +923,35 @@
         <w:pStyle w:val="Heading2"/>
       </w:pPr>
       <w:r>
-        <w:t>BFS vs DFS</w:t>
+        <w:t>BFS vs DFS - The Critical Difference</w:t>
       </w:r>
     </w:p>
-    <w:tbl>
-      <w:tblPr>
-        <w:tblStyle w:val="LightShading-Accent1"/>
-        <w:tblW w:type="auto" w:w="0"/>
-        <w:tblLook w:firstColumn="1" w:firstRow="1" w:lastColumn="0" w:lastRow="0" w:noHBand="0" w:noVBand="1" w:val="04A0"/>
-      </w:tblPr>
-      <w:tblGrid>
-        <w:gridCol w:w="2880"/>
-        <w:gridCol w:w="2880"/>
-        <w:gridCol w:w="2880"/>
-      </w:tblGrid>
-      <w:tr>
-        <w:tc>
-          <w:tcPr>
-            <w:tcW w:type="dxa" w:w="2880"/>
-          </w:tcPr>
-          <w:p>
-            <w:r/>
-          </w:p>
-        </w:tc>
-        <w:tc>
-          <w:tcPr>
-            <w:tcW w:type="dxa" w:w="2880"/>
-          </w:tcPr>
-          <w:p>
-            <w:r>
-              <w:t>BFS</w:t>
-            </w:r>
-          </w:p>
-        </w:tc>
-        <w:tc>
-          <w:tcPr>
-            <w:tcW w:type="dxa" w:w="2880"/>
-          </w:tcPr>
-          <w:p>
-            <w:r>
-              <w:t>DFS</w:t>
-            </w:r>
-          </w:p>
-        </w:tc>
-      </w:tr>
-      <w:tr>
-        <w:tc>
-          <w:tcPr>
-            <w:tcW w:type="dxa" w:w="2880"/>
-          </w:tcPr>
-          <w:p>
-            <w:r>
-              <w:t>Strategy</w:t>
-            </w:r>
-          </w:p>
-        </w:tc>
-        <w:tc>
-          <w:tcPr>
-            <w:tcW w:type="dxa" w:w="2880"/>
-          </w:tcPr>
-          <w:p>
-            <w:r>
-              <w:t>Explore neighbors first (wide)</w:t>
-            </w:r>
-          </w:p>
-        </w:tc>
-        <w:tc>
-          <w:tcPr>
-            <w:tcW w:type="dxa" w:w="2880"/>
-          </w:tcPr>
-          <w:p>
-            <w:r>
-              <w:t>Go deep first</w:t>
-            </w:r>
-          </w:p>
-        </w:tc>
-      </w:tr>
-      <w:tr>
-        <w:tc>
-          <w:tcPr>
-            <w:tcW w:type="dxa" w:w="2880"/>
-          </w:tcPr>
-          <w:p>
-            <w:r>
-              <w:t>Data structure</w:t>
-            </w:r>
-          </w:p>
-        </w:tc>
-        <w:tc>
-          <w:tcPr>
-            <w:tcW w:type="dxa" w:w="2880"/>
-          </w:tcPr>
-          <w:p>
-            <w:r>
-              <w:t>Queue (FIFO)</w:t>
-            </w:r>
-          </w:p>
-        </w:tc>
-        <w:tc>
-          <w:tcPr>
-            <w:tcW w:type="dxa" w:w="2880"/>
-          </w:tcPr>
-          <w:p>
-            <w:r>
-              <w:t>Stack (LIFO)</w:t>
-            </w:r>
-          </w:p>
-        </w:tc>
-      </w:tr>
-      <w:tr>
-        <w:tc>
-          <w:tcPr>
-            <w:tcW w:type="dxa" w:w="2880"/>
-          </w:tcPr>
-          <w:p>
-            <w:r>
-              <w:t>Best for</w:t>
-            </w:r>
-          </w:p>
-        </w:tc>
-        <w:tc>
-          <w:tcPr>
-            <w:tcW w:type="dxa" w:w="2880"/>
-          </w:tcPr>
-          <w:p>
-            <w:r>
-              <w:t>Shortest path, social networks</w:t>
-            </w:r>
-          </w:p>
-        </w:tc>
-        <w:tc>
-          <w:tcPr>
-            <w:tcW w:type="dxa" w:w="2880"/>
-          </w:tcPr>
-          <w:p>
-            <w:r>
-              <w:t>Maze solving, puzzles</w:t>
-            </w:r>
-          </w:p>
-        </w:tc>
-      </w:tr>
-    </w:tbl>
+    <w:p>
+      <w:r>
+        <w:t>Look at the order carefully:</w:t>
+        <w:br/>
+        <w:br/>
+        <w:t>BFS: TECH -&gt; MEDIA -&gt; FINANCE -&gt; CONSUMER -&gt; RETAIL -&gt; ENERGY -&gt; HEALTHCARE -&gt; TRANSPORT</w:t>
+        <w:br/>
+        <w:t>DFS: TECH -&gt; MEDIA -&gt; CONSUMER -&gt; ENERGY -&gt; TRANSPORT -&gt; RETAIL -&gt; FINANCE -&gt; HEALTHCARE</w:t>
+        <w:br/>
+        <w:br/>
+        <w:t>Why are they different?</w:t>
+        <w:br/>
+        <w:br/>
+        <w:t>In BFS, FINANCE appears early (position 3) because it is only 2 steps from TECH. BFS visits all "level 1" sectors first, then all "level 2" sectors.</w:t>
+        <w:br/>
+        <w:br/>
+        <w:t>In DFS, CONSUMER appears early (position 3) because when DFS visits MEDIA, it picks one neighbor (CONSUMER) and follows it DEEP before trying other branches. DFS goes: TECH -&gt; MEDIA -&gt; CONSUMER -&gt; ENERGY -&gt; TRANSPORT (deep path), then backtracks to try RETAIL -&gt; FINANCE -&gt; HEALTHCARE.</w:t>
+        <w:br/>
+        <w:br/>
+        <w:t>Think of it this way:</w:t>
+        <w:br/>
+        <w:t xml:space="preserve">  BFS = "Whats nearby?" - explores outward in all directions</w:t>
+        <w:br/>
+        <w:t xml:space="preserve">  DFS = "Whats down this path?" - commits to one direction, goes as far as possible</w:t>
+      </w:r>
+    </w:p>
     <w:p/>
     <w:p>
       <w:pPr>
@@ -1033,7 +982,7 @@
         <w:t xml:space="preserve">Real-world analogy: </w:t>
       </w:r>
       <w:r>
-        <w:t>Organizing a deck of cards. Split the deck in half, have two friends each sort their half, then merge the two sorted piles by comparing the top card of each.</w:t>
+        <w:t>Organizing a deck of cards. Split the deck in half, have two friends each sort their half, then merge the two sorted piles.</w:t>
       </w:r>
     </w:p>
     <w:p>
@@ -1083,7 +1032,7 @@
     </w:p>
     <w:p>
       <w:r>
-        <w:t>Cheapest: Q0380 ($5.02)  |  Middle: T0085 ($594.80)  |  Costliest: C0073 ($1,217.95)</w:t>
+        <w:t>Cheapest: Q0380 ($5.02)  |  Middle: Q0002 ($594.47)  |  Costliest: C0073 ($1,217.95)</w:t>
       </w:r>
     </w:p>
     <w:p/>
@@ -1116,7 +1065,7 @@
         <w:t xml:space="preserve">Real-world analogy: </w:t>
       </w:r>
       <w:r>
-        <w:t>Looking up a word in a dictionary. Open to the middle. If your word comes later alphabetically, ignore the first half and open the middle of the second half.</w:t>
+        <w:t>Looking up a word in a dictionary. Open to the middle. If your word comes later, ignore the first half and open the middle of the second half.</w:t>
       </w:r>
     </w:p>
     <w:p>
@@ -1171,6 +1120,224 @@
     </w:p>
     <w:p/>
     <w:p>
+      <w:r>
+        <w:rPr/>
+        <w:t xml:space="preserve">What this result means:</w:t>
+      </w:r>
+    </w:p>
+    <w:p>
+      <w:r>
+        <w:rPr/>
+        <w:t xml:space="preserve">  Binary search found stocks whose price falls between the specified range.</w:t>
+      </w:r>
+    </w:p>
+    <w:p>
+      <w:r>
+        <w:rPr/>
+        <w:t xml:space="preserve">  The search sorted all 10,000 stocks by price using Merge Sort (O(n log n)),</w:t>
+      </w:r>
+    </w:p>
+    <w:p>
+      <w:r>
+        <w:rPr/>
+        <w:t xml:space="preserve">  then used Binary Search to find the first stock at or above the lower bound (O(log n) = ~14 comparisons).</w:t>
+      </w:r>
+    </w:p>
+    <w:p>
+      <w:r>
+        <w:rPr/>
+        <w:t xml:space="preserve">  After finding the lower bound, it scanned right until price exceeded the upper bound.</w:t>
+      </w:r>
+    </w:p>
+    <w:p/>
+    <w:p>
+      <w:r>
+        <w:rPr/>
+        <w:t xml:space="preserve">Why this is fast:</w:t>
+      </w:r>
+    </w:p>
+    <w:p>
+      <w:r>
+        <w:rPr/>
+        <w:t xml:space="preserve">  Without binary search: scan all 10,000 stocks -&gt; 10,000 comparisons</w:t>
+      </w:r>
+    </w:p>
+    <w:p>
+      <w:r>
+        <w:rPr/>
+        <w:t xml:space="preserve">  With binary search: 14 comparisons to find lower bound + scan matching stocks</w:t>
+      </w:r>
+    </w:p>
+    <w:p>
+      <w:r>
+        <w:rPr/>
+        <w:t xml:space="preserve">  For a range of $500-$510 on 10,000 stocks: ~14 + ~90 = ~104 operations</w:t>
+      </w:r>
+    </w:p>
+    <w:p>
+      <w:r>
+        <w:rPr/>
+        <w:t xml:space="preserve">  vs 10,000 for a linear scan. That is 96% fewer comparisons.</w:t>
+      </w:r>
+    </w:p>
+    <w:p/>
+    <w:p>
+      <w:r>
+        <w:rPr/>
+        <w:t xml:space="preserve">How to read the output:</w:t>
+      </w:r>
+    </w:p>
+    <w:p>
+      <w:r>
+        <w:rPr/>
+        <w:t xml:space="preserve">  count: number of stocks in the price range</w:t>
+      </w:r>
+    </w:p>
+    <w:p>
+      <w:r>
+        <w:rPr/>
+        <w:t xml:space="preserve">  Each stock shows: symbol, exact price, sector, and volume</w:t>
+      </w:r>
+    </w:p>
+    <w:p>
+      <w:r>
+        <w:rPr/>
+        <w:t xml:space="preserve">  Stocks are returned in ascending order by price (from merge sort)</w:t>
+      </w:r>
+    </w:p>
+    <w:p>
+      <w:r>
+        <w:rPr/>
+        <w:t xml:space="preserve">  The first stock is the lowest price &gt;= lower bound</w:t>
+      </w:r>
+    </w:p>
+    <w:p/>
+    <w:p>
+      <w:r>
+        <w:rPr/>
+        <w:t xml:space="preserve">YOUR TEST RESULT EXPLAINED:</w:t>
+      </w:r>
+    </w:p>
+    <w:p>
+      <w:r>
+        <w:rPr/>
+        <w:t xml:space="preserve">  You searched for stocks between $500 and $510.</w:t>
+      </w:r>
+    </w:p>
+    <w:p>
+      <w:r>
+        <w:rPr/>
+        <w:t xml:space="preserve">  The server returned 'count: 83' - meaning 83 stocks out of 10,000 fall in that range.</w:t>
+      </w:r>
+    </w:p>
+    <w:p/>
+    <w:p>
+      <w:r>
+        <w:rPr/>
+        <w:t xml:space="preserve">Step-by-step what happened:</w:t>
+      </w:r>
+    </w:p>
+    <w:p>
+      <w:r>
+        <w:rPr/>
+        <w:t xml:space="preserve">  1. Merge Sort sorted all 10,000 stocks by price from lowest to highest</w:t>
+      </w:r>
+    </w:p>
+    <w:p>
+      <w:r>
+        <w:rPr/>
+        <w:t xml:space="preserve">  2. Binary search found the first stock at or above $500 in ~14 comparisons</w:t>
+      </w:r>
+    </w:p>
+    <w:p>
+      <w:r>
+        <w:rPr/>
+        <w:t xml:space="preserve">  3. The server then scanned right (toward higher prices) until it hit $510</w:t>
+      </w:r>
+    </w:p>
+    <w:p>
+      <w:r>
+        <w:rPr/>
+        <w:t xml:space="preserve">  4. It collected all 83 stocks and returned them sorted by price</w:t>
+      </w:r>
+    </w:p>
+    <w:p/>
+    <w:p>
+      <w:r>
+        <w:rPr/>
+        <w:t xml:space="preserve">The output shows:</w:t>
+      </w:r>
+    </w:p>
+    <w:p>
+      <w:r>
+        <w:rPr/>
+        <w:t xml:space="preserve">  - Each stock's symbol, exact price, sector, volume</w:t>
+      </w:r>
+    </w:p>
+    <w:p>
+      <w:r>
+        <w:rPr/>
+        <w:t xml:space="preserve">  - Stocks listed from $500.21 (lowest in range) to $509.92 (highest below $510)</w:t>
+      </w:r>
+    </w:p>
+    <w:p>
+      <w:r>
+        <w:rPr/>
+        <w:t xml:space="preserve">  - Note that $510.00 would be included if any stock was exactly at that price</w:t>
+      </w:r>
+    </w:p>
+    <w:p/>
+    <w:p>
+      <w:r>
+        <w:rPr/>
+        <w:t xml:space="preserve">Why this is impressive:</w:t>
+      </w:r>
+    </w:p>
+    <w:p>
+      <w:r>
+        <w:rPr/>
+        <w:t xml:space="preserve">  Linear scan would check all 10,000 entries -&gt; 10,000 comparisons</w:t>
+      </w:r>
+    </w:p>
+    <w:p>
+      <w:r>
+        <w:rPr/>
+        <w:t xml:space="preserve">  Binary search checks ~14 entries -&gt; finds the starting point instantly</w:t>
+      </w:r>
+    </w:p>
+    <w:p>
+      <w:r>
+        <w:rPr/>
+        <w:t xml:space="preserve">  That is 99.86% fewer comparisons!</w:t>
+      </w:r>
+    </w:p>
+    <w:p/>
+    <w:p>
+      <w:r>
+        <w:rPr/>
+        <w:t xml:space="preserve">Try changing the range:</w:t>
+      </w:r>
+    </w:p>
+    <w:p>
+      <w:r>
+        <w:rPr/>
+        <w:t xml:space="preserve">  Set-Content -Path `$env:TEMP\search.json" -Value '{"low":50,"high":100}'</w:t>
+      </w:r>
+    </w:p>
+    <w:p>
+      <w:r>
+        <w:rPr/>
+        <w:t xml:space="preserve">  Then re-run the curl command. Notice how fast it responds!</w:t>
+      </w:r>
+    </w:p>
+    <w:p>
+      <w:r>
+        <w:rPr/>
+        <w:t xml:space="preserve">  The last stock is the highest price &lt;= upper bound</w:t>
+      </w:r>
+    </w:p>
+    <w:p/>
+    <w:p>
       <w:pPr>
         <w:pStyle w:val="Heading1"/>
       </w:pPr>
@@ -1188,7 +1355,7 @@
     </w:p>
     <w:p>
       <w:r>
-        <w:t>Keeps the most recently accessed stocks in a fast buffer. When full, evicts the one that has not been used in the longest time.</w:t>
+        <w:t>Keeps the most recently accessed stocks in a fast buffer. When full, evicts the one not used the longest.</w:t>
       </w:r>
     </w:p>
     <w:p>
@@ -1199,7 +1366,7 @@
         <w:t xml:space="preserve">Real-world analogy: </w:t>
       </w:r>
       <w:r>
-        <w:t>A desk drawer for frequently used files. If the drawer is full and you need a new file, you remove the one you have not looked at in the longest time.</w:t>
+        <w:t>A desk drawer for frequently used files. If full, remove the one you have not looked at in the longest time.</w:t>
       </w:r>
     </w:p>
     <w:p>
@@ -1213,8 +1380,6 @@
     <w:p>
       <w:r>
         <w:t>HashMap (instant lookups by key) + Doubly Linked List (O(1) reordering).</w:t>
-        <w:br/>
-        <w:t>This lets us find, move, and evict items in constant time.</w:t>
       </w:r>
     </w:p>
     <w:p>

</xml_diff>